<commit_message>
Update Report 2: add F2 block MOFA factor, fix F1 VE range, finalize sections 9-10
</commit_message>
<xml_diff>
--- a/CpG_Pipeline_Progress_Report_2.docx
+++ b/CpG_Pipeline_Progress_Report_2.docx
@@ -5733,7 +5733,7 @@
         <w:spacing w:after="80" w:before="60"/>
       </w:pPr>
       <w:r>
-        <w:t xml:space="preserve">MOFA+ converged in 146 iterations (5 factors, 9 groups, 1 view). Factor 1 is the dominant factor, explaining 2.6–5.3% of variance in every cohort, indicating shared methylation variation across all exposure types and tissues. Its top CpGs are distributed across chr10:2,354,038–2,416,040 (a 62 kb band in the middle of the block), with no concentration near the Phase 1 hotspot. Factor 3 is highly specific to cfdna_GD120 (5.52% variance explained) and Factor 4 to cfdna_GD150 (3.36%), capturing gestational-stage-specific cfDNA methylation dynamics. No factor-label association survived Bonferroni correction (45 tests; best p = 0.035).</w:t>
+        <w:t xml:space="preserve">MOFA+ converged in 146 iterations (5 factors, 9 groups, 1 view). MOFA+ converged in 146 iterations (5 factors, 9 groups, 1 view). Factor 1 is the dominant factor, explaining 2.6–5.3% variance in tissue cohorts (wildfire 5.3%, obesity groups 3.0–3.9%, stress 2.6%) but only 0.1–0.9% in cfDNA cohorts, indicating shared methylation variation across exposure types and tissues. Its top CpGs are distributed across chr10:2,354,038–2,416,040 (a 62 kb band in the middle of the block), with no concentration near the Phase 1 hotspot. Factor 2 shows secondary brain-tissue enrichment, with highest VE in obesity_hippocampus (2.78%) and wildfire (1.74%), and negligible signal in cfDNA cohorts. Factor 3 is highly specific to cfdna_GD120 (5.52% variance explained) and Factor 4 to cfdna_GD150 (3.36%), capturing gestational-stage-specific cfDNA methylation dynamics. No factor-label association survived Bonferroni correction (45 tests; best p = 0.035, F1 in obesity_prefrontalcortex).</w:t>
       </w:r>
     </w:p>
     <w:p>
@@ -6003,6 +6003,78 @@
             <w:r>
               <w:rPr/>
               <w:t xml:space="preserve">Shared block-wide variation</w:t>
+            </w:r>
+          </w:p>
+        </w:tc>
+      </w:tr>
+      <w:tr>
+        <w:tc>
+          <w:tcPr>
+            <w:tcW w:w="1560" w:type="dxa"/>
+            <w:shd w:val="clear" w:color="auto" w:fill="FFFFFF"/>
+          </w:tcPr>
+          <w:p>
+            <w:pPr>
+              <w:spacing w:after="60" w:before="60"/>
+            </w:pPr>
+            <w:r>
+              <w:t xml:space="preserve">F2</w:t>
+            </w:r>
+          </w:p>
+        </w:tc>
+        <w:tc>
+          <w:tcPr>
+            <w:tcW w:w="2200" w:type="dxa"/>
+            <w:shd w:val="clear" w:color="auto" w:fill="FFFFFF"/>
+          </w:tcPr>
+          <w:p>
+            <w:pPr>
+              <w:spacing w:after="60" w:before="60"/>
+            </w:pPr>
+            <w:r>
+              <w:t xml:space="preserve">obesity_hippocampus, wildfire</w:t>
+            </w:r>
+          </w:p>
+        </w:tc>
+        <w:tc>
+          <w:tcPr>
+            <w:tcW w:w="900" w:type="dxa"/>
+            <w:shd w:val="clear" w:color="auto" w:fill="FFFFFF"/>
+          </w:tcPr>
+          <w:p>
+            <w:pPr>
+              <w:spacing w:after="60" w:before="60"/>
+            </w:pPr>
+            <w:r>
+              <w:t xml:space="preserve">1.4–2.8</w:t>
+            </w:r>
+          </w:p>
+        </w:tc>
+        <w:tc>
+          <w:tcPr>
+            <w:tcW w:w="2700" w:type="dxa"/>
+            <w:shd w:val="clear" w:color="auto" w:fill="FFFFFF"/>
+          </w:tcPr>
+          <w:p>
+            <w:pPr>
+              <w:spacing w:after="60" w:before="60"/>
+            </w:pPr>
+            <w:r>
+              <w:t xml:space="preserve">Distributed</w:t>
+            </w:r>
+          </w:p>
+        </w:tc>
+        <w:tc>
+          <w:tcPr>
+            <w:tcW w:w="2000" w:type="dxa"/>
+            <w:shd w:val="clear" w:color="auto" w:fill="FFFFFF"/>
+          </w:tcPr>
+          <w:p>
+            <w:pPr>
+              <w:spacing w:after="60" w:before="60"/>
+            </w:pPr>
+            <w:r>
+              <w:t xml:space="preserve">Brain/tissue enriched</w:t>
             </w:r>
           </w:p>
         </w:tc>

</xml_diff>